<commit_message>
Adaptar sistema para processar marcadores do troca.docx - v2.3
</commit_message>
<xml_diff>
--- a/public/troca.docx
+++ b/public/troca.docx
@@ -556,6 +556,14 @@
           <w:sz w:val="28"/>
           <w:szCs w:val="28"/>
         </w:rPr>
+        <w:t>_NOVO</w:t>
+      </w:r>
+      <w:r>
+        <w:rPr>
+          <w:color w:val="000000"/>
+          <w:sz w:val="28"/>
+          <w:szCs w:val="28"/>
+        </w:rPr>
         <w:t>}</w:t>
       </w:r>
     </w:p>
@@ -578,7 +586,31 @@
           <w:sz w:val="28"/>
           <w:szCs w:val="28"/>
         </w:rPr>
-        <w:t>Patrimonio:{PATRIMONIO}</w:t>
+        <w:t>Patrimonio:{PATRIMONIO</w:t>
+      </w:r>
+      <w:r>
+        <w:rPr>
+          <w:color w:val="000000"/>
+          <w:sz w:val="28"/>
+          <w:szCs w:val="28"/>
+        </w:rPr>
+        <w:t>_NOVO</w:t>
+      </w:r>
+      <w:r>
+        <w:rPr>
+          <w:color w:val="000000"/>
+          <w:sz w:val="28"/>
+          <w:szCs w:val="28"/>
+        </w:rPr>
+        <w:t xml:space="preserve"> </w:t>
+      </w:r>
+      <w:r>
+        <w:rPr>
+          <w:color w:val="000000"/>
+          <w:sz w:val="28"/>
+          <w:szCs w:val="28"/>
+        </w:rPr>
+        <w:t>}</w:t>
       </w:r>
     </w:p>
     <w:p>
@@ -624,6 +656,22 @@
           <w:sz w:val="28"/>
           <w:szCs w:val="28"/>
         </w:rPr>
+        <w:t>_NOVO</w:t>
+      </w:r>
+      <w:r>
+        <w:rPr>
+          <w:color w:val="000000"/>
+          <w:sz w:val="28"/>
+          <w:szCs w:val="28"/>
+        </w:rPr>
+        <w:t xml:space="preserve"> </w:t>
+      </w:r>
+      <w:r>
+        <w:rPr>
+          <w:color w:val="000000"/>
+          <w:sz w:val="28"/>
+          <w:szCs w:val="28"/>
+        </w:rPr>
         <w:t>}</w:t>
       </w:r>
     </w:p>
@@ -663,6 +711,22 @@
           <w:szCs w:val="28"/>
         </w:rPr>
         <w:t>NUMERO_SERIE</w:t>
+      </w:r>
+      <w:r>
+        <w:rPr>
+          <w:color w:val="000000"/>
+          <w:sz w:val="28"/>
+          <w:szCs w:val="28"/>
+        </w:rPr>
+        <w:t>_NOVO</w:t>
+      </w:r>
+      <w:r>
+        <w:rPr>
+          <w:color w:val="000000"/>
+          <w:sz w:val="28"/>
+          <w:szCs w:val="28"/>
+        </w:rPr>
+        <w:t xml:space="preserve"> </w:t>
       </w:r>
       <w:r>
         <w:rPr>

</xml_diff>